<commit_message>
docs: finalize graduation submission materials
</commit_message>
<xml_diff>
--- a/docs/110122188_De cuong KLTN 2026.docx
+++ b/docs/110122188_De cuong KLTN 2026.docx
@@ -1373,7 +1373,25 @@
           <w:szCs w:val="24"/>
           <w:lang w:val="vi-VN"/>
         </w:rPr>
-        <w:t xml:space="preserve">Chương 1: Tổng quan đề tài. </w:t>
+        <w:t xml:space="preserve">Chương 1: </w:t>
+      </w:r>
+      <w:r>
+        <w:rPr>
+          <w:rFonts w:ascii="Times New Roman" w:hAnsi="Times New Roman" w:cs="Times New Roman"/>
+          <w:sz w:val="24"/>
+          <w:szCs w:val="24"/>
+          <w:lang w:val="vi-VN"/>
+        </w:rPr>
+        <w:t>Giới thiệu</w:t>
+      </w:r>
+      <w:r>
+        <w:rPr>
+          <w:rFonts w:ascii="Times New Roman" w:hAnsi="Times New Roman" w:cs="Times New Roman"/>
+          <w:sz w:val="24"/>
+          <w:szCs w:val="24"/>
+          <w:lang w:val="vi-VN"/>
+        </w:rPr>
+        <w:t xml:space="preserve"> đề tài. </w:t>
       </w:r>
     </w:p>
     <w:p>
@@ -1433,7 +1451,25 @@
           <w:szCs w:val="24"/>
           <w:lang w:val="vi-VN"/>
         </w:rPr>
-        <w:t xml:space="preserve">Chương 3: Phân tích và Thiết kế hệ thống. </w:t>
+        <w:t xml:space="preserve">Chương 3: </w:t>
+      </w:r>
+      <w:r>
+        <w:rPr>
+          <w:rFonts w:ascii="Times New Roman" w:hAnsi="Times New Roman" w:cs="Times New Roman"/>
+          <w:sz w:val="24"/>
+          <w:szCs w:val="24"/>
+          <w:lang w:val="vi-VN"/>
+        </w:rPr>
+        <w:t>Hiện thực hóa nghiên cứu</w:t>
+      </w:r>
+      <w:r>
+        <w:rPr>
+          <w:rFonts w:ascii="Times New Roman" w:hAnsi="Times New Roman" w:cs="Times New Roman"/>
+          <w:sz w:val="24"/>
+          <w:szCs w:val="24"/>
+          <w:lang w:val="vi-VN"/>
+        </w:rPr>
+        <w:t xml:space="preserve">. </w:t>
       </w:r>
     </w:p>
     <w:p>
@@ -1463,7 +1499,25 @@
           <w:szCs w:val="24"/>
           <w:lang w:val="vi-VN"/>
         </w:rPr>
-        <w:t xml:space="preserve">Chương 4: Triển khai và Đánh giá kết quả. </w:t>
+        <w:t xml:space="preserve">Chương 4: </w:t>
+      </w:r>
+      <w:r>
+        <w:rPr>
+          <w:rFonts w:ascii="Times New Roman" w:hAnsi="Times New Roman" w:cs="Times New Roman"/>
+          <w:sz w:val="24"/>
+          <w:szCs w:val="24"/>
+          <w:lang w:val="vi-VN"/>
+        </w:rPr>
+        <w:t>Kết quả nghiên cứu</w:t>
+      </w:r>
+      <w:r>
+        <w:rPr>
+          <w:rFonts w:ascii="Times New Roman" w:hAnsi="Times New Roman" w:cs="Times New Roman"/>
+          <w:sz w:val="24"/>
+          <w:szCs w:val="24"/>
+          <w:lang w:val="vi-VN"/>
+        </w:rPr>
+        <w:t xml:space="preserve">. </w:t>
       </w:r>
     </w:p>
     <w:p>

</xml_diff>